<commit_message>
Render pull_request c549608d2dbbeccba0d5c28eb1e5c44755652c0f Sharpen the opinion — five claims promoted from descriptive to positional (#9) c549608d2dbbeccba0d5c28eb1e5c44755652c0f
</commit_message>
<xml_diff>
--- a/pr/37/manuscript.docx
+++ b/pr/37/manuscript.docx
@@ -1014,7 +1014,7 @@
         <w:t xml:space="preserve"> </w:t>
       </w:r>
       <w:r>
-        <w:t xml:space="preserve">Standard bibliometrics therefore systematically understate reuse, and programs that lean on citation counts as their primary impact KPI are measuring reach rather than influence.</w:t>
+        <w:t xml:space="preserve">Standard bibliometrics therefore systematically understate reuse, and programs that lean on citation counts as their primary impact key performance indicator (KPI) are measuring reach rather than influence.</w:t>
       </w:r>
       <w:r>
         <w:t xml:space="preserve"> </w:t>
@@ -1564,7 +1564,7 @@
         <w:t xml:space="preserve"> </w:t>
       </w:r>
       <w:r>
-        <w:t xml:space="preserve">Manual FAIR audits do not scale to CFDE-sized portfolios; automated Gen2 indicators are the difference between a stated FAIR commitment and an inspectable one.</w:t>
+        <w:t xml:space="preserve">Manual FAIR audits do not scale to CFDE-sized portfolios; automated second-generation indicators are the difference between a stated FAIR commitment and an inspectable one.</w:t>
       </w:r>
     </w:p>
     <w:bookmarkEnd w:id="15"/>
@@ -7676,7 +7676,7 @@
         <w:t xml:space="preserve"> </w:t>
       </w:r>
       <w:r>
-        <w:t xml:space="preserve">This window will not last; once enough time has passed since policy onset, the counterfactual gets harder to recover, and funded programs should be establishing baselines now rather than after the data lands.</w:t>
+        <w:t xml:space="preserve">This window will not last; without pre-policy baselines captured now, the policy’s effect on sharing and reuse can be inferred but not measured.</w:t>
       </w:r>
     </w:p>
     <w:p>
@@ -8664,23 +8664,7 @@
         <w:t xml:space="preserve">	</w:t>
       </w:r>
       <w:r>
-        <w:t xml:space="preserve">Keeney, R.L.</w:t>
-      </w:r>
-      <w:r>
-        <w:t xml:space="preserve"> </w:t>
-      </w:r>
-      <w:r>
-        <w:rPr>
-          <w:i/>
-          <w:iCs/>
-        </w:rPr>
-        <w:t xml:space="preserve">et al.</w:t>
-      </w:r>
-      <w:r>
-        <w:t xml:space="preserve"> </w:t>
-      </w:r>
-      <w:r>
-        <w:t xml:space="preserve">(1976)</w:t>
+        <w:t xml:space="preserve">Keeney, R.L. and Raiffa, H. (1976)</w:t>
       </w:r>
       <w:r>
         <w:t xml:space="preserve"> </w:t>

</xml_diff>